<commit_message>
Update CV and Word source
</commit_message>
<xml_diff>
--- a/files/CV-Hongyue_Yu-Beihang.docx
+++ b/files/CV-Hongyue_Yu-Beihang.docx
@@ -1016,19 +1016,93 @@
         <w:jc w:val="both"/>
         <w:rPr>
           <w:rStyle w:val="11"/>
-          <w:rFonts w:hint="eastAsia" w:ascii="Times New Roman" w:hAnsi="Times New Roman"/>
-          <w:iCs/>
-          <w:color w:val="auto"/>
-          <w:u w:val="none"/>
-          <w:lang w:eastAsia="zh-CN"/>
-        </w:rPr>
-      </w:pPr>
-      <w:r>
-        <w:rPr>
-          <w:rStyle w:val="11"/>
-          <w:rFonts w:hint="eastAsia" w:ascii="Times New Roman" w:hAnsi="Times New Roman"/>
-          <w:b w:val="0"/>
-          <w:bCs w:val="0"/>
+          <w:rFonts w:ascii="Times New Roman" w:hAnsi="Times New Roman"/>
+          <w:iCs/>
+          <w:color w:val="auto"/>
+          <w:u w:val="none"/>
+          <w:lang w:eastAsia="zh-CN"/>
+        </w:rPr>
+      </w:pPr>
+      <w:r>
+        <w:rPr>
+          <w:rStyle w:val="11"/>
+          <w:rFonts w:hint="eastAsia" w:ascii="Times New Roman" w:hAnsi="Times New Roman"/>
+          <w:b/>
+          <w:bCs/>
+          <w:iCs/>
+          <w:color w:val="auto"/>
+          <w:u w:val="none"/>
+          <w:lang w:val="en-US" w:eastAsia="zh-CN"/>
+        </w:rPr>
+        <w:t>H</w:t>
+      </w:r>
+      <w:r>
+        <w:rPr>
+          <w:rStyle w:val="11"/>
+          <w:rFonts w:hint="default" w:ascii="Times New Roman" w:hAnsi="Times New Roman"/>
+          <w:b/>
+          <w:bCs/>
+          <w:iCs/>
+          <w:color w:val="auto"/>
+          <w:u w:val="none"/>
+          <w:lang w:val="en-US" w:eastAsia="zh-CN"/>
+        </w:rPr>
+        <w:t>ongyue</w:t>
+      </w:r>
+      <w:r>
+        <w:rPr>
+          <w:rStyle w:val="11"/>
+          <w:rFonts w:hint="eastAsia" w:ascii="Times New Roman" w:hAnsi="Times New Roman"/>
+          <w:b/>
+          <w:bCs/>
+          <w:iCs/>
+          <w:color w:val="auto"/>
+          <w:u w:val="none"/>
+          <w:lang w:eastAsia="zh-CN"/>
+        </w:rPr>
+        <w:t xml:space="preserve"> </w:t>
+      </w:r>
+      <w:r>
+        <w:rPr>
+          <w:rStyle w:val="11"/>
+          <w:rFonts w:hint="eastAsia" w:ascii="Times New Roman" w:hAnsi="Times New Roman"/>
+          <w:b/>
+          <w:bCs/>
+          <w:iCs/>
+          <w:color w:val="auto"/>
+          <w:u w:val="none"/>
+          <w:lang w:val="en-US" w:eastAsia="zh-CN"/>
+        </w:rPr>
+        <w:t>Yu</w:t>
+      </w:r>
+      <w:r>
+        <w:rPr>
+          <w:rStyle w:val="11"/>
+          <w:rFonts w:hint="eastAsia" w:ascii="Times New Roman" w:hAnsi="Times New Roman"/>
+          <w:b/>
+          <w:bCs/>
+          <w:iCs/>
+          <w:color w:val="auto"/>
+          <w:u w:val="none"/>
+          <w:lang w:eastAsia="zh-CN"/>
+        </w:rPr>
+        <w:t>,</w:t>
+      </w:r>
+      <w:r>
+        <w:rPr>
+          <w:rStyle w:val="11"/>
+          <w:rFonts w:hint="eastAsia" w:ascii="Times New Roman" w:hAnsi="Times New Roman"/>
+          <w:iCs/>
+          <w:color w:val="auto"/>
+          <w:u w:val="none"/>
+          <w:lang w:eastAsia="zh-CN"/>
+        </w:rPr>
+        <w:t xml:space="preserve"> </w:t>
+      </w:r>
+      <w:r>
+        <w:rPr>
+          <w:rStyle w:val="11"/>
+          <w:rFonts w:hint="eastAsia" w:ascii="Times New Roman" w:hAnsi="Times New Roman"/>
           <w:iCs/>
           <w:color w:val="auto"/>
           <w:u w:val="none"/>
@@ -1040,8 +1114,6 @@
         <w:rPr>
           <w:rStyle w:val="11"/>
           <w:rFonts w:hint="default" w:ascii="Times New Roman" w:hAnsi="Times New Roman"/>
-          <w:b w:val="0"/>
-          <w:bCs w:val="0"/>
           <w:iCs/>
           <w:color w:val="auto"/>
           <w:u w:val="none"/>
@@ -1053,8 +1125,72 @@
         <w:rPr>
           <w:rStyle w:val="11"/>
           <w:rFonts w:hint="eastAsia" w:ascii="Times New Roman" w:hAnsi="Times New Roman"/>
-          <w:b w:val="0"/>
-          <w:bCs w:val="0"/>
+          <w:iCs/>
+          <w:color w:val="auto"/>
+          <w:u w:val="none"/>
+          <w:lang w:eastAsia="zh-CN"/>
+        </w:rPr>
+        <w:t xml:space="preserve">. Li, </w:t>
+      </w:r>
+      <w:r>
+        <w:rPr>
+          <w:rStyle w:val="11"/>
+          <w:rFonts w:hint="default" w:ascii="Times New Roman" w:hAnsi="Times New Roman"/>
+          <w:iCs/>
+          <w:color w:val="auto"/>
+          <w:u w:val="none"/>
+          <w:lang w:val="en-US" w:eastAsia="zh-CN"/>
+        </w:rPr>
+        <w:t>et al.</w:t>
+      </w:r>
+      <w:r>
+        <w:rPr>
+          <w:rStyle w:val="11"/>
+          <w:rFonts w:hint="eastAsia" w:ascii="Times New Roman" w:hAnsi="Times New Roman"/>
+          <w:iCs/>
+          <w:color w:val="auto"/>
+          <w:u w:val="none"/>
+          <w:lang w:eastAsia="zh-CN"/>
+        </w:rPr>
+        <w:t>“</w:t>
+      </w:r>
+      <w:r>
+        <w:rPr>
+          <w:rStyle w:val="11"/>
+          <w:rFonts w:hint="eastAsia" w:ascii="Times New Roman" w:hAnsi="Times New Roman"/>
+          <w:iCs/>
+          <w:color w:val="auto"/>
+          <w:u w:val="none"/>
+          <w:lang w:val="en-US" w:eastAsia="zh-CN"/>
+        </w:rPr>
+        <w:t>TDD-Agent: Test-Driven Reasoning for Code Generation</w:t>
+      </w:r>
+      <w:r>
+        <w:rPr>
+          <w:rStyle w:val="11"/>
+          <w:rFonts w:hint="eastAsia" w:ascii="Times New Roman" w:hAnsi="Times New Roman"/>
+          <w:iCs/>
+          <w:color w:val="auto"/>
+          <w:u w:val="none"/>
+          <w:lang w:eastAsia="zh-CN"/>
+        </w:rPr>
+        <w:t>,</w:t>
+      </w:r>
+      <w:r>
+        <w:rPr>
+          <w:rStyle w:val="11"/>
+          <w:rFonts w:ascii="Times New Roman" w:hAnsi="Times New Roman"/>
+          <w:iCs/>
+          <w:color w:val="auto"/>
+          <w:u w:val="none"/>
+          <w:lang w:eastAsia="zh-CN"/>
+        </w:rPr>
+        <w:t>”</w:t>
+      </w:r>
+      <w:r>
+        <w:rPr>
+          <w:rStyle w:val="11"/>
+          <w:rFonts w:hint="eastAsia" w:ascii="Times New Roman" w:hAnsi="Times New Roman"/>
           <w:iCs/>
           <w:color w:val="auto"/>
           <w:u w:val="none"/>
@@ -1066,329 +1202,87 @@
         <w:rPr>
           <w:rStyle w:val="11"/>
           <w:rFonts w:hint="eastAsia" w:ascii="Times New Roman" w:hAnsi="Times New Roman"/>
-          <w:b w:val="0"/>
-          <w:bCs w:val="0"/>
-          <w:iCs/>
-          <w:color w:val="auto"/>
-          <w:u w:val="none"/>
-          <w:lang w:val="en-US" w:eastAsia="zh-CN"/>
-        </w:rPr>
-        <w:t>Li</w:t>
-      </w:r>
-      <w:r>
-        <w:rPr>
-          <w:rStyle w:val="11"/>
-          <w:rFonts w:hint="eastAsia" w:ascii="Times New Roman" w:hAnsi="Times New Roman"/>
-          <w:b w:val="0"/>
-          <w:bCs w:val="0"/>
-          <w:iCs/>
-          <w:color w:val="auto"/>
-          <w:u w:val="none"/>
-          <w:lang w:eastAsia="zh-CN"/>
-        </w:rPr>
-        <w:t>,</w:t>
-      </w:r>
-      <w:r>
-        <w:rPr>
-          <w:rStyle w:val="11"/>
-          <w:rFonts w:hint="eastAsia" w:ascii="Times New Roman" w:hAnsi="Times New Roman"/>
-          <w:iCs/>
-          <w:color w:val="auto"/>
-          <w:u w:val="none"/>
-          <w:lang w:eastAsia="zh-CN"/>
-        </w:rPr>
-        <w:t xml:space="preserve"> Y</w:t>
+          <w:i/>
+          <w:color w:val="auto"/>
+          <w:u w:val="none"/>
+          <w:lang w:val="en-US" w:eastAsia="zh-CN"/>
+        </w:rPr>
+        <w:t>Conference</w:t>
+      </w:r>
+      <w:r>
+        <w:rPr>
+          <w:rStyle w:val="11"/>
+          <w:rFonts w:hint="eastAsia" w:ascii="Times New Roman" w:hAnsi="Times New Roman"/>
+          <w:i/>
+          <w:color w:val="auto"/>
+          <w:u w:val="none"/>
+          <w:lang w:eastAsia="zh-CN"/>
+        </w:rPr>
+        <w:t xml:space="preserve"> </w:t>
+      </w:r>
+      <w:r>
+        <w:rPr>
+          <w:rStyle w:val="11"/>
+          <w:rFonts w:hint="eastAsia" w:ascii="Times New Roman" w:hAnsi="Times New Roman"/>
+          <w:i/>
+          <w:color w:val="auto"/>
+          <w:u w:val="none"/>
+          <w:lang w:val="en-US" w:eastAsia="zh-CN"/>
+        </w:rPr>
+        <w:t>on Empirical Methods in Natural Language Processing</w:t>
+      </w:r>
+      <w:r>
+        <w:rPr>
+          <w:rStyle w:val="11"/>
+          <w:rFonts w:hint="eastAsia" w:ascii="Times New Roman" w:hAnsi="Times New Roman"/>
+          <w:i w:val="0"/>
+          <w:iCs/>
+          <w:color w:val="auto"/>
+          <w:u w:val="none"/>
+          <w:lang w:val="en-US" w:eastAsia="zh-CN"/>
+        </w:rPr>
+        <w:t xml:space="preserve"> (</w:t>
+      </w:r>
+      <w:r>
+        <w:rPr>
+          <w:rStyle w:val="11"/>
+          <w:rFonts w:hint="eastAsia" w:ascii="Times New Roman" w:hAnsi="Times New Roman"/>
+          <w:b/>
+          <w:bCs/>
+          <w:i w:val="0"/>
+          <w:iCs/>
+          <w:color w:val="auto"/>
+          <w:u w:val="none"/>
+          <w:lang w:val="en-US" w:eastAsia="zh-CN"/>
+        </w:rPr>
+        <w:t>EMNLP 2026</w:t>
+      </w:r>
+      <w:r>
+        <w:rPr>
+          <w:rStyle w:val="11"/>
+          <w:rFonts w:hint="eastAsia" w:ascii="Times New Roman" w:hAnsi="Times New Roman"/>
+          <w:i w:val="0"/>
+          <w:iCs/>
+          <w:color w:val="auto"/>
+          <w:u w:val="none"/>
+          <w:lang w:val="en-US" w:eastAsia="zh-CN"/>
+        </w:rPr>
+        <w:t>), May 2026.</w:t>
       </w:r>
       <w:r>
         <w:rPr>
           <w:rStyle w:val="11"/>
           <w:rFonts w:hint="default" w:ascii="Times New Roman" w:hAnsi="Times New Roman"/>
-          <w:iCs/>
-          <w:color w:val="auto"/>
-          <w:u w:val="none"/>
-          <w:lang w:val="en-US" w:eastAsia="zh-CN"/>
-        </w:rPr>
-        <w:t>uan</w:t>
-      </w:r>
-      <w:r>
-        <w:rPr>
-          <w:rStyle w:val="11"/>
-          <w:rFonts w:hint="eastAsia" w:ascii="Times New Roman" w:hAnsi="Times New Roman"/>
-          <w:iCs/>
-          <w:color w:val="auto"/>
-          <w:u w:val="none"/>
-          <w:lang w:eastAsia="zh-CN"/>
+          <w:i w:val="0"/>
+          <w:iCs/>
+          <w:color w:val="auto"/>
+          <w:u w:val="none"/>
+          <w:lang w:val="en-US" w:eastAsia="zh-CN"/>
         </w:rPr>
         <w:t xml:space="preserve"> </w:t>
       </w:r>
       <w:r>
         <w:rPr>
-          <w:rStyle w:val="11"/>
-          <w:rFonts w:hint="eastAsia" w:ascii="Times New Roman" w:hAnsi="Times New Roman"/>
-          <w:iCs/>
-          <w:color w:val="auto"/>
-          <w:u w:val="none"/>
-          <w:lang w:val="en-US" w:eastAsia="zh-CN"/>
-        </w:rPr>
-        <w:t>Yuan</w:t>
-      </w:r>
-      <w:r>
-        <w:rPr>
-          <w:rStyle w:val="11"/>
-          <w:rFonts w:hint="eastAsia" w:ascii="Times New Roman" w:hAnsi="Times New Roman"/>
-          <w:iCs/>
-          <w:color w:val="auto"/>
-          <w:u w:val="none"/>
-          <w:lang w:eastAsia="zh-CN"/>
-        </w:rPr>
-        <w:t xml:space="preserve">, </w:t>
-      </w:r>
-      <w:r>
-        <w:rPr>
-          <w:rStyle w:val="11"/>
-          <w:rFonts w:hint="eastAsia" w:ascii="Times New Roman" w:hAnsi="Times New Roman"/>
-          <w:b/>
-          <w:bCs/>
-          <w:iCs/>
-          <w:color w:val="auto"/>
-          <w:u w:val="none"/>
-          <w:lang w:val="en-US" w:eastAsia="zh-CN"/>
-        </w:rPr>
-        <w:t>H</w:t>
-      </w:r>
-      <w:r>
-        <w:rPr>
-          <w:rStyle w:val="11"/>
-          <w:rFonts w:hint="default" w:ascii="Times New Roman" w:hAnsi="Times New Roman"/>
-          <w:b/>
-          <w:bCs/>
-          <w:iCs/>
-          <w:color w:val="auto"/>
-          <w:u w:val="none"/>
-          <w:lang w:val="en-US" w:eastAsia="zh-CN"/>
-        </w:rPr>
-        <w:t>ongyue</w:t>
-      </w:r>
-      <w:r>
-        <w:rPr>
-          <w:rStyle w:val="11"/>
-          <w:rFonts w:hint="eastAsia" w:ascii="Times New Roman" w:hAnsi="Times New Roman"/>
-          <w:b/>
-          <w:bCs/>
-          <w:iCs/>
-          <w:color w:val="auto"/>
-          <w:u w:val="none"/>
-          <w:lang w:eastAsia="zh-CN"/>
-        </w:rPr>
-        <w:t xml:space="preserve"> </w:t>
-      </w:r>
-      <w:r>
-        <w:rPr>
-          <w:rStyle w:val="11"/>
-          <w:rFonts w:hint="eastAsia" w:ascii="Times New Roman" w:hAnsi="Times New Roman"/>
-          <w:b/>
-          <w:bCs/>
-          <w:iCs/>
-          <w:color w:val="auto"/>
-          <w:u w:val="none"/>
-          <w:lang w:val="en-US" w:eastAsia="zh-CN"/>
-        </w:rPr>
-        <w:t>Yu</w:t>
-      </w:r>
-      <w:r>
-        <w:rPr>
-          <w:rStyle w:val="11"/>
-          <w:rFonts w:hint="eastAsia" w:ascii="Times New Roman" w:hAnsi="Times New Roman"/>
-          <w:iCs/>
-          <w:color w:val="auto"/>
-          <w:u w:val="none"/>
-          <w:lang w:eastAsia="zh-CN"/>
-        </w:rPr>
-        <w:t xml:space="preserve">, </w:t>
-      </w:r>
-      <w:r>
-        <w:rPr>
-          <w:rStyle w:val="11"/>
-          <w:rFonts w:hint="eastAsia" w:ascii="Times New Roman" w:hAnsi="Times New Roman"/>
-          <w:iCs/>
-          <w:color w:val="auto"/>
-          <w:u w:val="none"/>
-          <w:lang w:val="en-US" w:eastAsia="zh-CN"/>
-        </w:rPr>
-        <w:t>et</w:t>
-      </w:r>
-      <w:r>
-        <w:rPr>
-          <w:rStyle w:val="11"/>
-          <w:rFonts w:hint="default" w:ascii="Times New Roman" w:hAnsi="Times New Roman"/>
-          <w:iCs/>
-          <w:color w:val="auto"/>
-          <w:u w:val="none"/>
-          <w:lang w:val="en-US" w:eastAsia="zh-CN"/>
-        </w:rPr>
-        <w:t xml:space="preserve"> al.</w:t>
-      </w:r>
-      <w:r>
-        <w:rPr>
-          <w:rStyle w:val="11"/>
-          <w:rFonts w:hint="eastAsia" w:ascii="Times New Roman" w:hAnsi="Times New Roman"/>
-          <w:iCs/>
-          <w:color w:val="auto"/>
-          <w:u w:val="none"/>
-          <w:lang w:eastAsia="zh-CN"/>
-        </w:rPr>
-        <w:t>“</w:t>
-      </w:r>
-      <w:r>
-        <w:rPr>
-          <w:rStyle w:val="11"/>
-          <w:rFonts w:hint="eastAsia" w:ascii="Times New Roman" w:hAnsi="Times New Roman"/>
-          <w:iCs/>
-          <w:color w:val="auto"/>
-          <w:u w:val="none"/>
-          <w:lang w:val="en-US" w:eastAsia="zh-CN"/>
-        </w:rPr>
-        <w:t>CoCoEvo: Co-Evolution of Programs and Test Cases to Enhance Code Generation</w:t>
-      </w:r>
-      <w:r>
-        <w:rPr>
-          <w:rStyle w:val="11"/>
-          <w:rFonts w:hint="eastAsia" w:ascii="Times New Roman" w:hAnsi="Times New Roman"/>
-          <w:iCs/>
-          <w:color w:val="auto"/>
-          <w:u w:val="none"/>
-          <w:lang w:eastAsia="zh-CN"/>
-        </w:rPr>
-        <w:t>,</w:t>
-      </w:r>
-      <w:r>
-        <w:rPr>
-          <w:rStyle w:val="11"/>
-          <w:rFonts w:ascii="Times New Roman" w:hAnsi="Times New Roman"/>
-          <w:iCs/>
-          <w:color w:val="auto"/>
-          <w:u w:val="none"/>
-          <w:lang w:eastAsia="zh-CN"/>
-        </w:rPr>
-        <w:t xml:space="preserve">” </w:t>
-      </w:r>
-      <w:r>
-        <w:rPr>
-          <w:rStyle w:val="11"/>
-          <w:rFonts w:hint="eastAsia" w:ascii="Times New Roman" w:hAnsi="Times New Roman"/>
-          <w:i/>
-          <w:color w:val="auto"/>
-          <w:u w:val="none"/>
-          <w:lang w:eastAsia="zh-CN"/>
-        </w:rPr>
-        <w:t xml:space="preserve">IEEE Transactions on </w:t>
-      </w:r>
-      <w:r>
-        <w:rPr>
-          <w:rStyle w:val="11"/>
-          <w:rFonts w:hint="eastAsia" w:ascii="Times New Roman" w:hAnsi="Times New Roman"/>
-          <w:i/>
-          <w:color w:val="auto"/>
-          <w:u w:val="none"/>
-          <w:lang w:val="en-US" w:eastAsia="zh-CN"/>
-        </w:rPr>
-        <w:t>Evolutionary</w:t>
-      </w:r>
-      <w:r>
-        <w:rPr>
-          <w:rStyle w:val="11"/>
-          <w:rFonts w:hint="eastAsia" w:ascii="Times New Roman" w:hAnsi="Times New Roman"/>
-          <w:i/>
-          <w:color w:val="auto"/>
-          <w:u w:val="none"/>
-          <w:lang w:eastAsia="zh-CN"/>
-        </w:rPr>
-        <w:t xml:space="preserve"> </w:t>
-      </w:r>
-      <w:r>
-        <w:rPr>
-          <w:rStyle w:val="11"/>
-          <w:rFonts w:hint="eastAsia" w:ascii="Times New Roman" w:hAnsi="Times New Roman"/>
-          <w:i/>
-          <w:color w:val="auto"/>
-          <w:u w:val="none"/>
-          <w:lang w:val="en-US" w:eastAsia="zh-CN"/>
-        </w:rPr>
-        <w:t>Computation</w:t>
-      </w:r>
-      <w:r>
-        <w:rPr>
-          <w:rStyle w:val="11"/>
-          <w:rFonts w:hint="eastAsia" w:ascii="Times New Roman" w:hAnsi="Times New Roman"/>
-          <w:iCs/>
-          <w:color w:val="auto"/>
-          <w:u w:val="none"/>
-          <w:lang w:eastAsia="zh-CN"/>
-        </w:rPr>
-        <w:t>(</w:t>
-      </w:r>
-      <w:r>
-        <w:rPr>
-          <w:rStyle w:val="11"/>
-          <w:rFonts w:hint="eastAsia" w:ascii="Times New Roman" w:hAnsi="Times New Roman"/>
-          <w:b/>
-          <w:bCs/>
-          <w:iCs/>
-          <w:color w:val="auto"/>
-          <w:u w:val="none"/>
-          <w:lang w:eastAsia="zh-CN"/>
-        </w:rPr>
-        <w:t>T</w:t>
-      </w:r>
-      <w:r>
-        <w:rPr>
-          <w:rStyle w:val="11"/>
-          <w:rFonts w:hint="eastAsia" w:ascii="Times New Roman" w:hAnsi="Times New Roman"/>
-          <w:b/>
-          <w:bCs/>
-          <w:iCs/>
-          <w:color w:val="auto"/>
-          <w:u w:val="none"/>
-          <w:lang w:val="en-US" w:eastAsia="zh-CN"/>
-        </w:rPr>
-        <w:t>EVC</w:t>
-      </w:r>
-      <w:r>
-        <w:rPr>
-          <w:rStyle w:val="11"/>
-          <w:rFonts w:hint="eastAsia" w:ascii="Times New Roman" w:hAnsi="Times New Roman"/>
-          <w:iCs/>
-          <w:color w:val="auto"/>
-          <w:u w:val="none"/>
-          <w:lang w:eastAsia="zh-CN"/>
-        </w:rPr>
-        <w:t>), May 202</w:t>
-      </w:r>
-      <w:r>
-        <w:rPr>
-          <w:rStyle w:val="11"/>
-          <w:rFonts w:hint="eastAsia" w:ascii="Times New Roman" w:hAnsi="Times New Roman"/>
-          <w:iCs/>
-          <w:color w:val="auto"/>
-          <w:u w:val="none"/>
-          <w:lang w:val="en-US" w:eastAsia="zh-CN"/>
-        </w:rPr>
-        <w:t>5</w:t>
-      </w:r>
-      <w:r>
-        <w:rPr>
-          <w:rStyle w:val="11"/>
-          <w:rFonts w:hint="eastAsia" w:ascii="Times New Roman" w:hAnsi="Times New Roman"/>
-          <w:iCs/>
-          <w:color w:val="auto"/>
-          <w:u w:val="none"/>
-          <w:lang w:eastAsia="zh-CN"/>
-        </w:rPr>
-        <w:t xml:space="preserve">. </w:t>
-      </w:r>
-      <w:r>
-        <w:rPr>
-          <w:rStyle w:val="11"/>
           <w:rFonts w:hint="eastAsia" w:ascii="Times New Roman" w:hAnsi="Times New Roman"/>
           <w:iCs/>
           <w:color w:val="auto"/>
@@ -1399,18 +1293,16 @@
       </w:r>
       <w:r>
         <w:rPr>
-          <w:rStyle w:val="11"/>
-          <w:rFonts w:hint="eastAsia" w:ascii="Times New Roman" w:hAnsi="Times New Roman"/>
-          <w:iCs/>
-          <w:color w:val="auto"/>
-          <w:u w:val="none"/>
-          <w:lang w:eastAsia="zh-CN"/>
-        </w:rPr>
-        <w:instrText xml:space="preserve"> HYPERLINK "https://arxiv.org/abs/2502.10802" </w:instrText>
-      </w:r>
-      <w:r>
-        <w:rPr>
-          <w:rStyle w:val="11"/>
+          <w:rFonts w:hint="eastAsia" w:ascii="Times New Roman" w:hAnsi="Times New Roman"/>
+          <w:iCs/>
+          <w:color w:val="auto"/>
+          <w:u w:val="none"/>
+          <w:lang w:eastAsia="zh-CN"/>
+        </w:rPr>
+        <w:instrText xml:space="preserve"> HYPERLINK "https://arxiv.org/abs/2608.16742" </w:instrText>
+      </w:r>
+      <w:r>
+        <w:rPr>
           <w:rFonts w:hint="eastAsia" w:ascii="Times New Roman" w:hAnsi="Times New Roman"/>
           <w:iCs/>
           <w:color w:val="auto"/>
@@ -1426,11 +1318,28 @@
           <w:iCs/>
           <w:lang w:eastAsia="zh-CN"/>
         </w:rPr>
-        <w:t>[arxiv]</w:t>
-      </w:r>
-      <w:r>
-        <w:rPr>
-          <w:rStyle w:val="11"/>
+        <w:t>[</w:t>
+      </w:r>
+      <w:r>
+        <w:rPr>
+          <w:rStyle w:val="11"/>
+          <w:rFonts w:hint="eastAsia" w:ascii="Times New Roman" w:hAnsi="Times New Roman"/>
+          <w:iCs/>
+          <w:lang w:val="en-US" w:eastAsia="zh-CN"/>
+        </w:rPr>
+        <w:t>arxiv</w:t>
+      </w:r>
+      <w:r>
+        <w:rPr>
+          <w:rStyle w:val="11"/>
+          <w:rFonts w:hint="eastAsia" w:ascii="Times New Roman" w:hAnsi="Times New Roman"/>
+          <w:iCs/>
+          <w:lang w:eastAsia="zh-CN"/>
+        </w:rPr>
+        <w:t>]</w:t>
+      </w:r>
+      <w:r>
+        <w:rPr>
           <w:rFonts w:hint="eastAsia" w:ascii="Times New Roman" w:hAnsi="Times New Roman"/>
           <w:iCs/>
           <w:color w:val="auto"/>
@@ -1468,42 +1377,84 @@
           <w:u w:val="none"/>
           <w:lang w:eastAsia="zh-CN"/>
         </w:rPr>
-        <w:t xml:space="preserve">Proposed </w:t>
-      </w:r>
-      <w:r>
-        <w:rPr>
-          <w:rStyle w:val="11"/>
-          <w:rFonts w:hint="eastAsia" w:ascii="Times New Roman" w:hAnsi="Times New Roman"/>
-          <w:iCs/>
-          <w:color w:val="auto"/>
-          <w:u w:val="none"/>
-          <w:lang w:eastAsia="zh-CN"/>
-        </w:rPr>
-        <w:t xml:space="preserve">an </w:t>
-      </w:r>
-      <w:r>
-        <w:rPr>
-          <w:rStyle w:val="11"/>
-          <w:rFonts w:hint="default" w:ascii="Times New Roman" w:hAnsi="Times New Roman" w:cs="Times New Roman"/>
-          <w:b w:val="0"/>
-          <w:bCs w:val="0"/>
-          <w:iCs/>
-          <w:color w:val="auto"/>
-          <w:u w:val="none"/>
-          <w:lang w:eastAsia="zh-CN"/>
-        </w:rPr>
-        <w:t xml:space="preserve">LLM-based co-evolutionary framework </w:t>
-      </w:r>
-      <w:r>
-        <w:rPr>
-          <w:rStyle w:val="11"/>
-          <w:rFonts w:hint="eastAsia" w:ascii="Times New Roman" w:hAnsi="Times New Roman"/>
-          <w:iCs/>
-          <w:color w:val="auto"/>
-          <w:u w:val="none"/>
-          <w:lang w:eastAsia="zh-CN"/>
-        </w:rPr>
-        <w:t>that jointly generates and iteratively refines programs and test cases without relying on predefined test suites. CoCoEvo combines LLM-driven crossover and mutation, dynamic crossover-rate scheduling, coverage-guided test generation, and Pareto-based multi-objective test selection to improve both code correctness and test quality.</w:t>
+        <w:t>Proposed</w:t>
+      </w:r>
+      <w:r>
+        <w:rPr>
+          <w:rStyle w:val="11"/>
+          <w:rFonts w:hint="eastAsia" w:ascii="Times New Roman" w:hAnsi="Times New Roman"/>
+          <w:iCs/>
+          <w:color w:val="auto"/>
+          <w:u w:val="none"/>
+          <w:lang w:eastAsia="zh-CN"/>
+        </w:rPr>
+        <w:t xml:space="preserve"> a single-agent framework that operationalizes test-driven development for LLM-based code generation by generating tests before implementation and iteratively co-refining both tests and code using execution feedback. TDD-Agent treats tests as reasoning artifacts rather than fixed post-hoc validators, enabling models to identify implementation defects and correct flawed test assumptions throughout the process.</w:t>
+      </w:r>
+      <w:r>
+        <w:rPr>
+          <w:rStyle w:val="11"/>
+          <w:rFonts w:hint="eastAsia" w:ascii="Times New Roman" w:hAnsi="Times New Roman"/>
+          <w:iCs/>
+          <w:color w:val="auto"/>
+          <w:u w:val="none"/>
+          <w:lang w:val="en-US" w:eastAsia="zh-CN"/>
+        </w:rPr>
+        <w:t xml:space="preserve"> Evaluations on </w:t>
+      </w:r>
+      <w:r>
+        <w:rPr>
+          <w:rStyle w:val="11"/>
+          <w:rFonts w:hint="default" w:ascii="Times New Roman" w:hAnsi="Times New Roman"/>
+          <w:iCs/>
+          <w:color w:val="auto"/>
+          <w:u w:val="none"/>
+          <w:lang w:val="en-US" w:eastAsia="zh-CN"/>
+        </w:rPr>
+        <w:t>both function-level</w:t>
+      </w:r>
+      <w:r>
+        <w:rPr>
+          <w:rStyle w:val="11"/>
+          <w:rFonts w:hint="eastAsia" w:ascii="Times New Roman" w:hAnsi="Times New Roman"/>
+          <w:iCs/>
+          <w:color w:val="auto"/>
+          <w:u w:val="none"/>
+          <w:lang w:val="en-US" w:eastAsia="zh-CN"/>
+        </w:rPr>
+        <w:t xml:space="preserve"> and the repository-level benchmark</w:t>
+      </w:r>
+      <w:r>
+        <w:rPr>
+          <w:rStyle w:val="11"/>
+          <w:rFonts w:hint="default" w:ascii="Times New Roman" w:hAnsi="Times New Roman"/>
+          <w:iCs/>
+          <w:color w:val="auto"/>
+          <w:u w:val="none"/>
+          <w:lang w:val="en-US" w:eastAsia="zh-CN"/>
+        </w:rPr>
+        <w:t>s</w:t>
+      </w:r>
+      <w:r>
+        <w:rPr>
+          <w:rStyle w:val="11"/>
+          <w:rFonts w:hint="eastAsia" w:ascii="Times New Roman" w:hAnsi="Times New Roman"/>
+          <w:iCs/>
+          <w:color w:val="auto"/>
+          <w:u w:val="none"/>
+          <w:lang w:val="en-US" w:eastAsia="zh-CN"/>
+        </w:rPr>
+        <w:t xml:space="preserve"> showed consistent improvements over reasoning, retrieval, and agent-based baselines</w:t>
+      </w:r>
+      <w:r>
+        <w:rPr>
+          <w:rStyle w:val="11"/>
+          <w:rFonts w:hint="default" w:ascii="Times New Roman" w:hAnsi="Times New Roman"/>
+          <w:iCs/>
+          <w:color w:val="auto"/>
+          <w:u w:val="none"/>
+          <w:lang w:val="en-US" w:eastAsia="zh-CN"/>
+        </w:rPr>
+        <w:t>.</w:t>
       </w:r>
     </w:p>
     <w:p>
@@ -1893,7 +1844,7 @@
         <w:jc w:val="both"/>
         <w:rPr>
           <w:rStyle w:val="11"/>
-          <w:rFonts w:ascii="Times New Roman" w:hAnsi="Times New Roman"/>
+          <w:rFonts w:hint="eastAsia" w:ascii="Times New Roman" w:hAnsi="Times New Roman"/>
           <w:iCs/>
           <w:color w:val="auto"/>
           <w:u w:val="none"/>
@@ -1911,6 +1862,8 @@
         </w:rPr>
         <w:t xml:space="preserve">Identified the Self-Repair Trap, a failure mode in LLM-based test oracle generation where iterative execution-driven repair increasingly favors assertions that are easy to satisfy but less effective at revealing faults. Proposed DCAware, a computationally efficient, non-iterative framework that combines structured static program context with selectively retrieved dynamic execution states to improve oracle grounding. </w:t>
       </w:r>
+      <w:bookmarkStart w:id="2" w:name="_GoBack"/>
+      <w:bookmarkEnd w:id="2"/>
     </w:p>
     <w:p>
       <w:pPr>
@@ -1926,13 +1879,133 @@
         <w:jc w:val="both"/>
         <w:rPr>
           <w:rStyle w:val="11"/>
-          <w:rFonts w:ascii="Times New Roman" w:hAnsi="Times New Roman"/>
-          <w:iCs/>
-          <w:color w:val="auto"/>
-          <w:u w:val="none"/>
-          <w:lang w:eastAsia="zh-CN"/>
-        </w:rPr>
-      </w:pPr>
+          <w:rFonts w:hint="eastAsia" w:ascii="Times New Roman" w:hAnsi="Times New Roman"/>
+          <w:iCs/>
+          <w:color w:val="auto"/>
+          <w:u w:val="none"/>
+          <w:lang w:eastAsia="zh-CN"/>
+        </w:rPr>
+      </w:pPr>
+      <w:r>
+        <w:rPr>
+          <w:rStyle w:val="11"/>
+          <w:rFonts w:hint="eastAsia" w:ascii="Times New Roman" w:hAnsi="Times New Roman"/>
+          <w:b w:val="0"/>
+          <w:bCs w:val="0"/>
+          <w:iCs/>
+          <w:color w:val="auto"/>
+          <w:u w:val="none"/>
+          <w:lang w:val="en-US" w:eastAsia="zh-CN"/>
+        </w:rPr>
+        <w:t>K</w:t>
+      </w:r>
+      <w:r>
+        <w:rPr>
+          <w:rStyle w:val="11"/>
+          <w:rFonts w:hint="default" w:ascii="Times New Roman" w:hAnsi="Times New Roman"/>
+          <w:b w:val="0"/>
+          <w:bCs w:val="0"/>
+          <w:iCs/>
+          <w:color w:val="auto"/>
+          <w:u w:val="none"/>
+          <w:lang w:val="en-US" w:eastAsia="zh-CN"/>
+        </w:rPr>
+        <w:t>efan</w:t>
+      </w:r>
+      <w:r>
+        <w:rPr>
+          <w:rStyle w:val="11"/>
+          <w:rFonts w:hint="eastAsia" w:ascii="Times New Roman" w:hAnsi="Times New Roman"/>
+          <w:b w:val="0"/>
+          <w:bCs w:val="0"/>
+          <w:iCs/>
+          <w:color w:val="auto"/>
+          <w:u w:val="none"/>
+          <w:lang w:eastAsia="zh-CN"/>
+        </w:rPr>
+        <w:t xml:space="preserve"> </w:t>
+      </w:r>
+      <w:r>
+        <w:rPr>
+          <w:rStyle w:val="11"/>
+          <w:rFonts w:hint="eastAsia" w:ascii="Times New Roman" w:hAnsi="Times New Roman"/>
+          <w:b w:val="0"/>
+          <w:bCs w:val="0"/>
+          <w:iCs/>
+          <w:color w:val="auto"/>
+          <w:u w:val="none"/>
+          <w:lang w:val="en-US" w:eastAsia="zh-CN"/>
+        </w:rPr>
+        <w:t>Li</w:t>
+      </w:r>
+      <w:r>
+        <w:rPr>
+          <w:rStyle w:val="11"/>
+          <w:rFonts w:hint="eastAsia" w:ascii="Times New Roman" w:hAnsi="Times New Roman"/>
+          <w:b w:val="0"/>
+          <w:bCs w:val="0"/>
+          <w:iCs/>
+          <w:color w:val="auto"/>
+          <w:u w:val="none"/>
+          <w:lang w:eastAsia="zh-CN"/>
+        </w:rPr>
+        <w:t>,</w:t>
+      </w:r>
+      <w:r>
+        <w:rPr>
+          <w:rStyle w:val="11"/>
+          <w:rFonts w:hint="eastAsia" w:ascii="Times New Roman" w:hAnsi="Times New Roman"/>
+          <w:iCs/>
+          <w:color w:val="auto"/>
+          <w:u w:val="none"/>
+          <w:lang w:eastAsia="zh-CN"/>
+        </w:rPr>
+        <w:t xml:space="preserve"> Y</w:t>
+      </w:r>
+      <w:r>
+        <w:rPr>
+          <w:rStyle w:val="11"/>
+          <w:rFonts w:hint="default" w:ascii="Times New Roman" w:hAnsi="Times New Roman"/>
+          <w:iCs/>
+          <w:color w:val="auto"/>
+          <w:u w:val="none"/>
+          <w:lang w:val="en-US" w:eastAsia="zh-CN"/>
+        </w:rPr>
+        <w:t>uan</w:t>
+      </w:r>
+      <w:r>
+        <w:rPr>
+          <w:rStyle w:val="11"/>
+          <w:rFonts w:hint="eastAsia" w:ascii="Times New Roman" w:hAnsi="Times New Roman"/>
+          <w:iCs/>
+          <w:color w:val="auto"/>
+          <w:u w:val="none"/>
+          <w:lang w:eastAsia="zh-CN"/>
+        </w:rPr>
+        <w:t xml:space="preserve"> </w:t>
+      </w:r>
+      <w:r>
+        <w:rPr>
+          <w:rStyle w:val="11"/>
+          <w:rFonts w:hint="eastAsia" w:ascii="Times New Roman" w:hAnsi="Times New Roman"/>
+          <w:iCs/>
+          <w:color w:val="auto"/>
+          <w:u w:val="none"/>
+          <w:lang w:val="en-US" w:eastAsia="zh-CN"/>
+        </w:rPr>
+        <w:t>Yuan</w:t>
+      </w:r>
+      <w:r>
+        <w:rPr>
+          <w:rStyle w:val="11"/>
+          <w:rFonts w:hint="eastAsia" w:ascii="Times New Roman" w:hAnsi="Times New Roman"/>
+          <w:iCs/>
+          <w:color w:val="auto"/>
+          <w:u w:val="none"/>
+          <w:lang w:eastAsia="zh-CN"/>
+        </w:rPr>
+        <w:t xml:space="preserve">, </w:t>
+      </w:r>
       <w:r>
         <w:rPr>
           <w:rStyle w:val="11"/>
@@ -1989,8 +2062,61 @@
         <w:rPr>
           <w:rStyle w:val="11"/>
           <w:rFonts w:hint="eastAsia" w:ascii="Times New Roman" w:hAnsi="Times New Roman"/>
-          <w:b/>
-          <w:bCs/>
+          <w:iCs/>
+          <w:color w:val="auto"/>
+          <w:u w:val="none"/>
+          <w:lang w:eastAsia="zh-CN"/>
+        </w:rPr>
+        <w:t xml:space="preserve">, </w:t>
+      </w:r>
+      <w:r>
+        <w:rPr>
+          <w:rStyle w:val="11"/>
+          <w:rFonts w:hint="eastAsia" w:ascii="Times New Roman" w:hAnsi="Times New Roman"/>
+          <w:iCs/>
+          <w:color w:val="auto"/>
+          <w:u w:val="none"/>
+          <w:lang w:val="en-US" w:eastAsia="zh-CN"/>
+        </w:rPr>
+        <w:t>et</w:t>
+      </w:r>
+      <w:r>
+        <w:rPr>
+          <w:rStyle w:val="11"/>
+          <w:rFonts w:hint="default" w:ascii="Times New Roman" w:hAnsi="Times New Roman"/>
+          <w:iCs/>
+          <w:color w:val="auto"/>
+          <w:u w:val="none"/>
+          <w:lang w:val="en-US" w:eastAsia="zh-CN"/>
+        </w:rPr>
+        <w:t xml:space="preserve"> al.</w:t>
+      </w:r>
+      <w:r>
+        <w:rPr>
+          <w:rStyle w:val="11"/>
+          <w:rFonts w:hint="eastAsia" w:ascii="Times New Roman" w:hAnsi="Times New Roman"/>
+          <w:iCs/>
+          <w:color w:val="auto"/>
+          <w:u w:val="none"/>
+          <w:lang w:eastAsia="zh-CN"/>
+        </w:rPr>
+        <w:t>“</w:t>
+      </w:r>
+      <w:r>
+        <w:rPr>
+          <w:rStyle w:val="11"/>
+          <w:rFonts w:hint="eastAsia" w:ascii="Times New Roman" w:hAnsi="Times New Roman"/>
+          <w:iCs/>
+          <w:color w:val="auto"/>
+          <w:u w:val="none"/>
+          <w:lang w:val="en-US" w:eastAsia="zh-CN"/>
+        </w:rPr>
+        <w:t>CoCoEvo: Co-Evolution of Programs and Test Cases to Enhance Code Generation</w:t>
+      </w:r>
+      <w:r>
+        <w:rPr>
+          <w:rStyle w:val="11"/>
+          <w:rFonts w:hint="eastAsia" w:ascii="Times New Roman" w:hAnsi="Times New Roman"/>
           <w:iCs/>
           <w:color w:val="auto"/>
           <w:u w:val="none"/>
@@ -2001,8 +2127,41 @@
       <w:r>
         <w:rPr>
           <w:rStyle w:val="11"/>
-          <w:rFonts w:hint="eastAsia" w:ascii="Times New Roman" w:hAnsi="Times New Roman"/>
-          <w:iCs/>
+          <w:rFonts w:ascii="Times New Roman" w:hAnsi="Times New Roman"/>
+          <w:iCs/>
+          <w:color w:val="auto"/>
+          <w:u w:val="none"/>
+          <w:lang w:eastAsia="zh-CN"/>
+        </w:rPr>
+        <w:t xml:space="preserve">” </w:t>
+      </w:r>
+      <w:r>
+        <w:rPr>
+          <w:rStyle w:val="11"/>
+          <w:rFonts w:hint="eastAsia" w:ascii="Times New Roman" w:hAnsi="Times New Roman"/>
+          <w:i/>
+          <w:color w:val="auto"/>
+          <w:u w:val="none"/>
+          <w:lang w:eastAsia="zh-CN"/>
+        </w:rPr>
+        <w:t xml:space="preserve">IEEE Transactions on </w:t>
+      </w:r>
+      <w:r>
+        <w:rPr>
+          <w:rStyle w:val="11"/>
+          <w:rFonts w:hint="eastAsia" w:ascii="Times New Roman" w:hAnsi="Times New Roman"/>
+          <w:i/>
+          <w:color w:val="auto"/>
+          <w:u w:val="none"/>
+          <w:lang w:val="en-US" w:eastAsia="zh-CN"/>
+        </w:rPr>
+        <w:t>Evolutionary</w:t>
+      </w:r>
+      <w:r>
+        <w:rPr>
+          <w:rStyle w:val="11"/>
+          <w:rFonts w:hint="eastAsia" w:ascii="Times New Roman" w:hAnsi="Times New Roman"/>
+          <w:i/>
           <w:color w:val="auto"/>
           <w:u w:val="none"/>
           <w:lang w:eastAsia="zh-CN"/>
@@ -2013,186 +2172,86 @@
         <w:rPr>
           <w:rStyle w:val="11"/>
           <w:rFonts w:hint="eastAsia" w:ascii="Times New Roman" w:hAnsi="Times New Roman"/>
-          <w:iCs/>
-          <w:color w:val="auto"/>
-          <w:u w:val="none"/>
-          <w:lang w:val="en-US" w:eastAsia="zh-CN"/>
-        </w:rPr>
-        <w:t>K</w:t>
-      </w:r>
-      <w:r>
-        <w:rPr>
-          <w:rStyle w:val="11"/>
-          <w:rFonts w:hint="default" w:ascii="Times New Roman" w:hAnsi="Times New Roman"/>
-          <w:iCs/>
-          <w:color w:val="auto"/>
-          <w:u w:val="none"/>
-          <w:lang w:val="en-US" w:eastAsia="zh-CN"/>
-        </w:rPr>
-        <w:t>efan</w:t>
-      </w:r>
-      <w:r>
-        <w:rPr>
-          <w:rStyle w:val="11"/>
-          <w:rFonts w:hint="eastAsia" w:ascii="Times New Roman" w:hAnsi="Times New Roman"/>
-          <w:iCs/>
-          <w:color w:val="auto"/>
-          <w:u w:val="none"/>
-          <w:lang w:eastAsia="zh-CN"/>
-        </w:rPr>
-        <w:t xml:space="preserve">. Li, </w:t>
-      </w:r>
-      <w:r>
-        <w:rPr>
-          <w:rStyle w:val="11"/>
-          <w:rFonts w:hint="default" w:ascii="Times New Roman" w:hAnsi="Times New Roman"/>
-          <w:iCs/>
-          <w:color w:val="auto"/>
-          <w:u w:val="none"/>
-          <w:lang w:val="en-US" w:eastAsia="zh-CN"/>
-        </w:rPr>
-        <w:t>et al.</w:t>
-      </w:r>
-      <w:r>
-        <w:rPr>
-          <w:rStyle w:val="11"/>
-          <w:rFonts w:hint="eastAsia" w:ascii="Times New Roman" w:hAnsi="Times New Roman"/>
-          <w:iCs/>
-          <w:color w:val="auto"/>
-          <w:u w:val="none"/>
-          <w:lang w:eastAsia="zh-CN"/>
-        </w:rPr>
-        <w:t>“</w:t>
-      </w:r>
-      <w:r>
-        <w:rPr>
-          <w:rStyle w:val="11"/>
-          <w:rFonts w:hint="eastAsia" w:ascii="Times New Roman" w:hAnsi="Times New Roman"/>
-          <w:iCs/>
-          <w:color w:val="auto"/>
-          <w:u w:val="none"/>
-          <w:lang w:val="en-US" w:eastAsia="zh-CN"/>
-        </w:rPr>
-        <w:t>TDD-Agent: Test-Driven Reasoning for Code Generation</w:t>
-      </w:r>
-      <w:r>
-        <w:rPr>
-          <w:rStyle w:val="11"/>
-          <w:rFonts w:hint="eastAsia" w:ascii="Times New Roman" w:hAnsi="Times New Roman"/>
-          <w:iCs/>
-          <w:color w:val="auto"/>
-          <w:u w:val="none"/>
-          <w:lang w:eastAsia="zh-CN"/>
-        </w:rPr>
-        <w:t>,</w:t>
-      </w:r>
-      <w:r>
-        <w:rPr>
-          <w:rStyle w:val="11"/>
-          <w:rFonts w:ascii="Times New Roman" w:hAnsi="Times New Roman"/>
-          <w:iCs/>
-          <w:color w:val="auto"/>
-          <w:u w:val="none"/>
-          <w:lang w:eastAsia="zh-CN"/>
-        </w:rPr>
-        <w:t>”</w:t>
-      </w:r>
-      <w:r>
-        <w:rPr>
-          <w:rStyle w:val="11"/>
-          <w:rFonts w:hint="eastAsia" w:ascii="Times New Roman" w:hAnsi="Times New Roman"/>
-          <w:iCs/>
-          <w:color w:val="auto"/>
-          <w:u w:val="none"/>
-          <w:lang w:eastAsia="zh-CN"/>
-        </w:rPr>
-        <w:t xml:space="preserve"> </w:t>
-      </w:r>
-      <w:r>
-        <w:rPr>
-          <w:rStyle w:val="11"/>
-          <w:rFonts w:hint="eastAsia" w:ascii="Times New Roman" w:hAnsi="Times New Roman"/>
-          <w:i/>
-          <w:color w:val="auto"/>
-          <w:u w:val="none"/>
-          <w:lang w:val="en-US" w:eastAsia="zh-CN"/>
-        </w:rPr>
-        <w:t>Conference</w:t>
-      </w:r>
-      <w:r>
-        <w:rPr>
-          <w:rStyle w:val="11"/>
-          <w:rFonts w:hint="eastAsia" w:ascii="Times New Roman" w:hAnsi="Times New Roman"/>
-          <w:i/>
-          <w:color w:val="auto"/>
-          <w:u w:val="none"/>
-          <w:lang w:eastAsia="zh-CN"/>
-        </w:rPr>
-        <w:t xml:space="preserve"> </w:t>
-      </w:r>
-      <w:r>
-        <w:rPr>
-          <w:rStyle w:val="11"/>
-          <w:rFonts w:hint="eastAsia" w:ascii="Times New Roman" w:hAnsi="Times New Roman"/>
-          <w:i/>
-          <w:color w:val="auto"/>
-          <w:u w:val="none"/>
-          <w:lang w:val="en-US" w:eastAsia="zh-CN"/>
-        </w:rPr>
-        <w:t>on Empirical Methods in Natural Language Processing</w:t>
-      </w:r>
-      <w:r>
-        <w:rPr>
-          <w:rStyle w:val="11"/>
-          <w:rFonts w:hint="eastAsia" w:ascii="Times New Roman" w:hAnsi="Times New Roman"/>
-          <w:i w:val="0"/>
-          <w:iCs/>
-          <w:color w:val="auto"/>
-          <w:u w:val="none"/>
-          <w:lang w:val="en-US" w:eastAsia="zh-CN"/>
-        </w:rPr>
-        <w:t xml:space="preserve"> (</w:t>
-      </w:r>
-      <w:r>
-        <w:rPr>
-          <w:rStyle w:val="11"/>
-          <w:rFonts w:hint="eastAsia" w:ascii="Times New Roman" w:hAnsi="Times New Roman"/>
-          <w:b/>
-          <w:bCs/>
-          <w:i w:val="0"/>
-          <w:iCs/>
-          <w:color w:val="auto"/>
-          <w:u w:val="none"/>
-          <w:lang w:val="en-US" w:eastAsia="zh-CN"/>
-        </w:rPr>
-        <w:t>EMNLP 2026</w:t>
-      </w:r>
-      <w:r>
-        <w:rPr>
-          <w:rStyle w:val="11"/>
-          <w:rFonts w:hint="eastAsia" w:ascii="Times New Roman" w:hAnsi="Times New Roman"/>
-          <w:i w:val="0"/>
-          <w:iCs/>
-          <w:color w:val="auto"/>
-          <w:u w:val="none"/>
-          <w:lang w:val="en-US" w:eastAsia="zh-CN"/>
-        </w:rPr>
-        <w:t>), May 2026.</w:t>
-      </w:r>
-      <w:r>
-        <w:rPr>
-          <w:rStyle w:val="11"/>
-          <w:rFonts w:hint="default" w:ascii="Times New Roman" w:hAnsi="Times New Roman"/>
-          <w:i w:val="0"/>
-          <w:iCs/>
-          <w:color w:val="auto"/>
-          <w:u w:val="none"/>
-          <w:lang w:val="en-US" w:eastAsia="zh-CN"/>
-        </w:rPr>
-        <w:t xml:space="preserve"> </w:t>
-      </w:r>
-      <w:r>
-        <w:rPr>
+          <w:i/>
+          <w:color w:val="auto"/>
+          <w:u w:val="none"/>
+          <w:lang w:val="en-US" w:eastAsia="zh-CN"/>
+        </w:rPr>
+        <w:t>Computation</w:t>
+      </w:r>
+      <w:r>
+        <w:rPr>
+          <w:rStyle w:val="11"/>
+          <w:rFonts w:hint="eastAsia" w:ascii="Times New Roman" w:hAnsi="Times New Roman"/>
+          <w:iCs/>
+          <w:color w:val="auto"/>
+          <w:u w:val="none"/>
+          <w:lang w:eastAsia="zh-CN"/>
+        </w:rPr>
+        <w:t>(</w:t>
+      </w:r>
+      <w:r>
+        <w:rPr>
+          <w:rStyle w:val="11"/>
+          <w:rFonts w:hint="eastAsia" w:ascii="Times New Roman" w:hAnsi="Times New Roman"/>
+          <w:b/>
+          <w:bCs/>
+          <w:iCs/>
+          <w:color w:val="auto"/>
+          <w:u w:val="none"/>
+          <w:lang w:eastAsia="zh-CN"/>
+        </w:rPr>
+        <w:t>T</w:t>
+      </w:r>
+      <w:r>
+        <w:rPr>
+          <w:rStyle w:val="11"/>
+          <w:rFonts w:hint="eastAsia" w:ascii="Times New Roman" w:hAnsi="Times New Roman"/>
+          <w:b/>
+          <w:bCs/>
+          <w:iCs/>
+          <w:color w:val="auto"/>
+          <w:u w:val="none"/>
+          <w:lang w:val="en-US" w:eastAsia="zh-CN"/>
+        </w:rPr>
+        <w:t>EVC</w:t>
+      </w:r>
+      <w:r>
+        <w:rPr>
+          <w:rStyle w:val="11"/>
+          <w:rFonts w:hint="eastAsia" w:ascii="Times New Roman" w:hAnsi="Times New Roman"/>
+          <w:iCs/>
+          <w:color w:val="auto"/>
+          <w:u w:val="none"/>
+          <w:lang w:eastAsia="zh-CN"/>
+        </w:rPr>
+        <w:t>), May 202</w:t>
+      </w:r>
+      <w:r>
+        <w:rPr>
+          <w:rStyle w:val="11"/>
+          <w:rFonts w:hint="eastAsia" w:ascii="Times New Roman" w:hAnsi="Times New Roman"/>
+          <w:iCs/>
+          <w:color w:val="auto"/>
+          <w:u w:val="none"/>
+          <w:lang w:val="en-US" w:eastAsia="zh-CN"/>
+        </w:rPr>
+        <w:t>5</w:t>
+      </w:r>
+      <w:r>
+        <w:rPr>
+          <w:rStyle w:val="11"/>
+          <w:rFonts w:hint="eastAsia" w:ascii="Times New Roman" w:hAnsi="Times New Roman"/>
+          <w:iCs/>
+          <w:color w:val="auto"/>
+          <w:u w:val="none"/>
+          <w:lang w:eastAsia="zh-CN"/>
+        </w:rPr>
+        <w:t xml:space="preserve">. </w:t>
+      </w:r>
+      <w:r>
+        <w:rPr>
+          <w:rStyle w:val="11"/>
           <w:rFonts w:hint="eastAsia" w:ascii="Times New Roman" w:hAnsi="Times New Roman"/>
           <w:iCs/>
           <w:color w:val="auto"/>
@@ -2203,16 +2262,18 @@
       </w:r>
       <w:r>
         <w:rPr>
-          <w:rFonts w:hint="eastAsia" w:ascii="Times New Roman" w:hAnsi="Times New Roman"/>
-          <w:iCs/>
-          <w:color w:val="auto"/>
-          <w:u w:val="none"/>
-          <w:lang w:eastAsia="zh-CN"/>
-        </w:rPr>
-        <w:instrText xml:space="preserve"> HYPERLINK "https://arxiv.org/abs/2608.16742" </w:instrText>
-      </w:r>
-      <w:r>
-        <w:rPr>
+          <w:rStyle w:val="11"/>
+          <w:rFonts w:hint="eastAsia" w:ascii="Times New Roman" w:hAnsi="Times New Roman"/>
+          <w:iCs/>
+          <w:color w:val="auto"/>
+          <w:u w:val="none"/>
+          <w:lang w:eastAsia="zh-CN"/>
+        </w:rPr>
+        <w:instrText xml:space="preserve"> HYPERLINK "https://arxiv.org/abs/2502.10802" </w:instrText>
+      </w:r>
+      <w:r>
+        <w:rPr>
+          <w:rStyle w:val="11"/>
           <w:rFonts w:hint="eastAsia" w:ascii="Times New Roman" w:hAnsi="Times New Roman"/>
           <w:iCs/>
           <w:color w:val="auto"/>
@@ -2228,28 +2289,11 @@
           <w:iCs/>
           <w:lang w:eastAsia="zh-CN"/>
         </w:rPr>
-        <w:t>[</w:t>
-      </w:r>
-      <w:r>
-        <w:rPr>
-          <w:rStyle w:val="11"/>
-          <w:rFonts w:hint="eastAsia" w:ascii="Times New Roman" w:hAnsi="Times New Roman"/>
-          <w:iCs/>
-          <w:lang w:val="en-US" w:eastAsia="zh-CN"/>
-        </w:rPr>
-        <w:t>arxiv</w:t>
-      </w:r>
-      <w:r>
-        <w:rPr>
-          <w:rStyle w:val="11"/>
-          <w:rFonts w:hint="eastAsia" w:ascii="Times New Roman" w:hAnsi="Times New Roman"/>
-          <w:iCs/>
-          <w:lang w:eastAsia="zh-CN"/>
-        </w:rPr>
-        <w:t>]</w:t>
-      </w:r>
-      <w:r>
-        <w:rPr>
+        <w:t>[arxiv]</w:t>
+      </w:r>
+      <w:r>
+        <w:rPr>
+          <w:rStyle w:val="11"/>
           <w:rFonts w:hint="eastAsia" w:ascii="Times New Roman" w:hAnsi="Times New Roman"/>
           <w:iCs/>
           <w:color w:val="auto"/>
@@ -2271,100 +2315,58 @@
         <w:jc w:val="both"/>
         <w:rPr>
           <w:rStyle w:val="11"/>
-          <w:rFonts w:ascii="Times New Roman" w:hAnsi="Times New Roman"/>
-          <w:iCs/>
-          <w:color w:val="auto"/>
-          <w:u w:val="none"/>
-          <w:lang w:eastAsia="zh-CN"/>
-        </w:rPr>
-      </w:pPr>
-      <w:r>
-        <w:rPr>
-          <w:rStyle w:val="11"/>
-          <w:rFonts w:ascii="Times New Roman" w:hAnsi="Times New Roman"/>
-          <w:iCs/>
-          <w:color w:val="auto"/>
-          <w:u w:val="none"/>
-          <w:lang w:eastAsia="zh-CN"/>
-        </w:rPr>
-        <w:t>Proposed</w:t>
-      </w:r>
-      <w:r>
-        <w:rPr>
-          <w:rStyle w:val="11"/>
-          <w:rFonts w:hint="eastAsia" w:ascii="Times New Roman" w:hAnsi="Times New Roman"/>
-          <w:iCs/>
-          <w:color w:val="auto"/>
-          <w:u w:val="none"/>
-          <w:lang w:eastAsia="zh-CN"/>
-        </w:rPr>
-        <w:t xml:space="preserve"> a single-agent framework that operationalizes test-driven development for LLM-based code generation by generating tests before implementation and iteratively co-refining both tests and code using execution feedback. TDD-Agent treats tests as reasoning artifacts rather than fixed post-hoc validators, enabling models to identify implementation defects and correct flawed test assumptions throughout the process.</w:t>
-      </w:r>
-      <w:r>
-        <w:rPr>
-          <w:rStyle w:val="11"/>
-          <w:rFonts w:hint="eastAsia" w:ascii="Times New Roman" w:hAnsi="Times New Roman"/>
-          <w:iCs/>
-          <w:color w:val="auto"/>
-          <w:u w:val="none"/>
-          <w:lang w:val="en-US" w:eastAsia="zh-CN"/>
-        </w:rPr>
-        <w:t xml:space="preserve"> Evaluations on </w:t>
-      </w:r>
-      <w:r>
-        <w:rPr>
-          <w:rStyle w:val="11"/>
-          <w:rFonts w:hint="default" w:ascii="Times New Roman" w:hAnsi="Times New Roman"/>
-          <w:iCs/>
-          <w:color w:val="auto"/>
-          <w:u w:val="none"/>
-          <w:lang w:val="en-US" w:eastAsia="zh-CN"/>
-        </w:rPr>
-        <w:t>both function-level</w:t>
-      </w:r>
-      <w:r>
-        <w:rPr>
-          <w:rStyle w:val="11"/>
-          <w:rFonts w:hint="eastAsia" w:ascii="Times New Roman" w:hAnsi="Times New Roman"/>
-          <w:iCs/>
-          <w:color w:val="auto"/>
-          <w:u w:val="none"/>
-          <w:lang w:val="en-US" w:eastAsia="zh-CN"/>
-        </w:rPr>
-        <w:t xml:space="preserve"> and the repository-level benchmark</w:t>
-      </w:r>
-      <w:r>
-        <w:rPr>
-          <w:rStyle w:val="11"/>
-          <w:rFonts w:hint="default" w:ascii="Times New Roman" w:hAnsi="Times New Roman"/>
-          <w:iCs/>
-          <w:color w:val="auto"/>
-          <w:u w:val="none"/>
-          <w:lang w:val="en-US" w:eastAsia="zh-CN"/>
-        </w:rPr>
-        <w:t>s</w:t>
-      </w:r>
-      <w:r>
-        <w:rPr>
-          <w:rStyle w:val="11"/>
-          <w:rFonts w:hint="eastAsia" w:ascii="Times New Roman" w:hAnsi="Times New Roman"/>
-          <w:iCs/>
-          <w:color w:val="auto"/>
-          <w:u w:val="none"/>
-          <w:lang w:val="en-US" w:eastAsia="zh-CN"/>
-        </w:rPr>
-        <w:t xml:space="preserve"> showed consistent improvements over reasoning, retrieval, and agent-based baselines</w:t>
-      </w:r>
-      <w:r>
-        <w:rPr>
-          <w:rStyle w:val="11"/>
-          <w:rFonts w:hint="default" w:ascii="Times New Roman" w:hAnsi="Times New Roman"/>
-          <w:iCs/>
-          <w:color w:val="auto"/>
-          <w:u w:val="none"/>
-          <w:lang w:val="en-US" w:eastAsia="zh-CN"/>
-        </w:rPr>
-        <w:t>.</w:t>
+          <w:rFonts w:hint="eastAsia" w:ascii="Times New Roman" w:hAnsi="Times New Roman"/>
+          <w:iCs/>
+          <w:color w:val="auto"/>
+          <w:u w:val="none"/>
+          <w:lang w:eastAsia="zh-CN"/>
+        </w:rPr>
+      </w:pPr>
+      <w:r>
+        <w:rPr>
+          <w:rStyle w:val="11"/>
+          <w:rFonts w:ascii="Times New Roman" w:hAnsi="Times New Roman"/>
+          <w:iCs/>
+          <w:color w:val="auto"/>
+          <w:u w:val="none"/>
+          <w:lang w:eastAsia="zh-CN"/>
+        </w:rPr>
+        <w:t xml:space="preserve">Proposed </w:t>
+      </w:r>
+      <w:r>
+        <w:rPr>
+          <w:rStyle w:val="11"/>
+          <w:rFonts w:hint="eastAsia" w:ascii="Times New Roman" w:hAnsi="Times New Roman"/>
+          <w:iCs/>
+          <w:color w:val="auto"/>
+          <w:u w:val="none"/>
+          <w:lang w:eastAsia="zh-CN"/>
+        </w:rPr>
+        <w:t xml:space="preserve">an </w:t>
+      </w:r>
+      <w:r>
+        <w:rPr>
+          <w:rStyle w:val="11"/>
+          <w:rFonts w:hint="default" w:ascii="Times New Roman" w:hAnsi="Times New Roman" w:cs="Times New Roman"/>
+          <w:b w:val="0"/>
+          <w:bCs w:val="0"/>
+          <w:iCs/>
+          <w:color w:val="auto"/>
+          <w:u w:val="none"/>
+          <w:lang w:eastAsia="zh-CN"/>
+        </w:rPr>
+        <w:t xml:space="preserve">LLM-based co-evolutionary framework </w:t>
+      </w:r>
+      <w:r>
+        <w:rPr>
+          <w:rStyle w:val="11"/>
+          <w:rFonts w:hint="eastAsia" w:ascii="Times New Roman" w:hAnsi="Times New Roman"/>
+          <w:iCs/>
+          <w:color w:val="auto"/>
+          <w:u w:val="none"/>
+          <w:lang w:eastAsia="zh-CN"/>
+        </w:rPr>
+        <w:t>that jointly generates and iteratively refines programs and test cases without relying on predefined test suites. CoCoEvo combines LLM-driven crossover and mutation, dynamic crossover-rate scheduling, coverage-guided test generation, and Pareto-based multi-objective test selection to improve both code correctness and test quality.</w:t>
       </w:r>
     </w:p>
     <w:p>
@@ -4039,8 +4041,6 @@
         </w:rPr>
         <w:t>, macOS, Windows</w:t>
       </w:r>
-      <w:bookmarkStart w:id="2" w:name="_GoBack"/>
-      <w:bookmarkEnd w:id="2"/>
     </w:p>
     <w:sectPr>
       <w:headerReference r:id="rId5" w:type="default"/>

</xml_diff>